<commit_message>
Plan: GH Project visibility spike
Agent-Logs-Url: https://github.com/norrisaftcc/milestone-26sp-review/sessions/3924dabd-5fdf-4449-9ab5-e81cabbc6151

Co-authored-by: norrisaftcc <15367101+norrisaftcc@users.noreply.github.com>
</commit_message>
<xml_diff>
--- a/outputs/01_Introduction.docx
+++ b/outputs/01_Introduction.docx
@@ -2,7 +2,7 @@
 <file path=word/document.xml><?xml version="1.0" encoding="utf-8"?>
 <w:document xmlns:w="http://schemas.openxmlformats.org/wordprocessingml/2006/main" xmlns:m="http://schemas.openxmlformats.org/officeDocument/2006/math" xmlns:r="http://schemas.openxmlformats.org/officeDocument/2006/relationships" xmlns:o="urn:schemas-microsoft-com:office:office" xmlns:v="urn:schemas-microsoft-com:vml" xmlns:w10="urn:schemas-microsoft-com:office:word" xmlns:a="http://schemas.openxmlformats.org/drawingml/2006/main" xmlns:pic="http://schemas.openxmlformats.org/drawingml/2006/picture" xmlns:wp="http://schemas.openxmlformats.org/drawingml/2006/wordprocessingDrawing">
   <w:body>
-    <w:bookmarkStart w:id="13" w:name="introduction"/>
+    <w:bookmarkStart w:id="24" w:name="introduction"/>
     <w:p>
       <w:pPr>
         <w:pStyle w:val="Heading1"/>
@@ -17,8 +17,8 @@
       </w:pPr>
       <w:r>
         <w:rPr>
+          <w:bCs/>
           <w:b/>
-          <w:bCs/>
         </w:rPr>
         <w:t xml:space="preserve">Spring 2026 Performance Review · Binder Front Matter</w:t>
       </w:r>
@@ -27,8 +27,8 @@
       </w:r>
       <w:r>
         <w:rPr>
+          <w:bCs/>
           <w:b/>
-          <w:bCs/>
         </w:rPr>
         <w:t xml:space="preserve">Instructor:</w:t>
       </w:r>
@@ -43,8 +43,8 @@
       </w:r>
       <w:r>
         <w:rPr>
+          <w:bCs/>
           <w:b/>
-          <w:bCs/>
         </w:rPr>
         <w:t xml:space="preserve">Program:</w:t>
       </w:r>
@@ -59,8 +59,8 @@
       </w:r>
       <w:r>
         <w:rPr>
+          <w:bCs/>
           <w:b/>
-          <w:bCs/>
         </w:rPr>
         <w:t xml:space="preserve">Review Period:</w:t>
       </w:r>
@@ -78,7 +78,7 @@
         </w:pict>
       </w:r>
     </w:p>
-    <w:bookmarkStart w:id="9" w:name="what-this-binder-documents"/>
+    <w:bookmarkStart w:id="20" w:name="what-this-binder-documents"/>
     <w:p>
       <w:pPr>
         <w:pStyle w:val="Heading2"/>
@@ -113,16 +113,16 @@
     </w:p>
     <w:p>
       <w:pPr>
-        <w:pStyle w:val="Compact"/>
         <w:numPr>
           <w:ilvl w:val="0"/>
           <w:numId w:val="1001"/>
         </w:numPr>
+        <w:pStyle w:val="Compact"/>
       </w:pPr>
       <w:r>
         <w:rPr>
+          <w:bCs/>
           <w:b/>
-          <w:bCs/>
         </w:rPr>
         <w:t xml:space="preserve">The reviewer with time</w:t>
       </w:r>
@@ -135,16 +135,16 @@
     </w:p>
     <w:p>
       <w:pPr>
-        <w:pStyle w:val="Compact"/>
         <w:numPr>
           <w:ilvl w:val="0"/>
           <w:numId w:val="1001"/>
         </w:numPr>
+        <w:pStyle w:val="Compact"/>
       </w:pPr>
       <w:r>
         <w:rPr>
+          <w:bCs/>
           <w:b/>
-          <w:bCs/>
         </w:rPr>
         <w:t xml:space="preserve">The reviewer without time</w:t>
       </w:r>
@@ -170,8 +170,8 @@
         </w:pict>
       </w:r>
     </w:p>
-    <w:bookmarkEnd w:id="9"/>
-    <w:bookmarkStart w:id="10" w:name="the-unifying-methodological-thread"/>
+    <w:bookmarkEnd w:id="20"/>
+    <w:bookmarkStart w:id="21" w:name="the-unifying-methodological-thread"/>
     <w:p>
       <w:pPr>
         <w:pStyle w:val="Heading2"/>
@@ -192,8 +192,8 @@
       </w:r>
       <w:r>
         <w:rPr>
+          <w:bCs/>
           <w:b/>
-          <w:bCs/>
         </w:rPr>
         <w:t xml:space="preserve">measure rate of change, not absolute position.</w:t>
       </w:r>
@@ -210,8 +210,8 @@
       </w:r>
       <w:r>
         <w:rPr>
+          <w:bCs/>
           <w:b/>
-          <w:bCs/>
         </w:rPr>
         <w:t xml:space="preserve">y</w:t>
       </w:r>
@@ -239,8 +239,8 @@
       </w:r>
       <w:r>
         <w:rPr>
+          <w:bCs/>
           <w:b/>
-          <w:bCs/>
         </w:rPr>
         <w:t xml:space="preserve">dy/dx</w:t>
       </w:r>
@@ -271,8 +271,8 @@
         </w:pict>
       </w:r>
     </w:p>
-    <w:bookmarkEnd w:id="10"/>
-    <w:bookmarkStart w:id="11" w:name="on-the-in-character-apparatus"/>
+    <w:bookmarkEnd w:id="21"/>
+    <w:bookmarkStart w:id="22" w:name="on-the-in-character-apparatus"/>
     <w:p>
       <w:pPr>
         <w:pStyle w:val="Heading2"/>
@@ -293,8 +293,8 @@
       </w:r>
       <w:r>
         <w:rPr>
+          <w:bCs/>
           <w:b/>
-          <w:bCs/>
         </w:rPr>
         <w:t xml:space="preserve">Sacred Workflow</w:t>
       </w:r>
@@ -321,8 +321,8 @@
       </w:r>
       <w:r>
         <w:rPr>
+          <w:bCs/>
           <w:b/>
-          <w:bCs/>
         </w:rPr>
         <w:t xml:space="preserve">clearance progression</w:t>
       </w:r>
@@ -337,8 +337,8 @@
       </w:r>
       <w:r>
         <w:rPr>
+          <w:bCs/>
           <w:b/>
-          <w:bCs/>
         </w:rPr>
         <w:t xml:space="preserve">GRAY clearance</w:t>
       </w:r>
@@ -353,8 +353,8 @@
       </w:r>
       <w:r>
         <w:rPr>
+          <w:iCs/>
           <w:i/>
-          <w:iCs/>
         </w:rPr>
         <w:t xml:space="preserve">Guidance, Review, Aesthetic Yield</w:t>
       </w:r>
@@ -366,8 +366,8 @@
       </w:r>
       <w:r>
         <w:rPr>
+          <w:bCs/>
           <w:b/>
-          <w:bCs/>
         </w:rPr>
         <w:t xml:space="preserve">YELLOW Exit Ticket</w:t>
       </w:r>
@@ -393,8 +393,8 @@
         </w:pict>
       </w:r>
     </w:p>
-    <w:bookmarkEnd w:id="11"/>
-    <w:bookmarkStart w:id="12" w:name="X1a8f4d0bc0c91a42b97b96c6ea78c1001143557"/>
+    <w:bookmarkEnd w:id="22"/>
+    <w:bookmarkStart w:id="23" w:name="X1a8f4d0bc0c91a42b97b96c6ea78c1001143557"/>
     <w:p>
       <w:pPr>
         <w:pStyle w:val="Heading2"/>
@@ -419,8 +419,8 @@
         <w:t xml:space="preserve">The Executive Summary that follows is the one-page version. Everything after it is the explanation.</w:t>
       </w:r>
     </w:p>
-    <w:bookmarkEnd w:id="12"/>
-    <w:bookmarkEnd w:id="13"/>
+    <w:bookmarkEnd w:id="23"/>
+    <w:bookmarkEnd w:id="24"/>
     <w:sectPr>
       <w:footnotePr>
         <w:numRestart w:val="eachSect"/>
@@ -456,14 +456,14 @@
 <file path=word/numbering.xml><?xml version="1.0" encoding="utf-8"?>
 <w:numbering xmlns:w="http://schemas.openxmlformats.org/wordprocessingml/2006/main">
   <w:abstractNum w:abstractNumId="990">
-    <w:nsid w:val="0000A990"/>
+    <w:nsid w:val="A990"/>
     <w:multiLevelType w:val="multilevel"/>
     <w:lvl w:ilvl="0">
       <w:numFmt w:val="bullet"/>
       <w:lvlText w:val=" "/>
       <w:lvlJc w:val="left"/>
       <w:pPr>
-        <w:ind w:left="720" w:hanging="360"/>
+        <w:ind w:left="720" w:hanging="480"/>
       </w:pPr>
     </w:lvl>
     <w:lvl w:ilvl="1">
@@ -471,7 +471,7 @@
       <w:lvlText w:val=" "/>
       <w:lvlJc w:val="left"/>
       <w:pPr>
-        <w:ind w:left="1440" w:hanging="360"/>
+        <w:ind w:left="1440" w:hanging="480"/>
       </w:pPr>
     </w:lvl>
     <w:lvl w:ilvl="2">
@@ -479,7 +479,7 @@
       <w:lvlText w:val=" "/>
       <w:lvlJc w:val="left"/>
       <w:pPr>
-        <w:ind w:left="2160" w:hanging="360"/>
+        <w:ind w:left="2160" w:hanging="480"/>
       </w:pPr>
     </w:lvl>
     <w:lvl w:ilvl="3">
@@ -487,7 +487,7 @@
       <w:lvlText w:val=" "/>
       <w:lvlJc w:val="left"/>
       <w:pPr>
-        <w:ind w:left="2880" w:hanging="360"/>
+        <w:ind w:left="2880" w:hanging="480"/>
       </w:pPr>
     </w:lvl>
     <w:lvl w:ilvl="4">
@@ -495,7 +495,7 @@
       <w:lvlText w:val=" "/>
       <w:lvlJc w:val="left"/>
       <w:pPr>
-        <w:ind w:left="3600" w:hanging="360"/>
+        <w:ind w:left="3600" w:hanging="480"/>
       </w:pPr>
     </w:lvl>
     <w:lvl w:ilvl="5">
@@ -503,7 +503,7 @@
       <w:lvlText w:val=" "/>
       <w:lvlJc w:val="left"/>
       <w:pPr>
-        <w:ind w:left="4320" w:hanging="360"/>
+        <w:ind w:left="4320" w:hanging="480"/>
       </w:pPr>
     </w:lvl>
     <w:lvl w:ilvl="6">
@@ -511,7 +511,7 @@
       <w:lvlText w:val=" "/>
       <w:lvlJc w:val="left"/>
       <w:pPr>
-        <w:ind w:left="5040" w:hanging="360"/>
+        <w:ind w:left="5040" w:hanging="480"/>
       </w:pPr>
     </w:lvl>
     <w:lvl w:ilvl="7">
@@ -519,7 +519,7 @@
       <w:lvlText w:val=" "/>
       <w:lvlJc w:val="left"/>
       <w:pPr>
-        <w:ind w:left="5760" w:hanging="360"/>
+        <w:ind w:left="5760" w:hanging="480"/>
       </w:pPr>
     </w:lvl>
     <w:lvl w:ilvl="8">
@@ -527,111 +527,84 @@
       <w:lvlText w:val=" "/>
       <w:lvlJc w:val="left"/>
       <w:pPr>
-        <w:ind w:left="6480" w:hanging="360"/>
+        <w:ind w:left="6480" w:hanging="480"/>
       </w:pPr>
     </w:lvl>
   </w:abstractNum>
   <w:abstractNum w:abstractNumId="991">
-    <w:nsid w:val="0000A991"/>
+    <w:nsid w:val="A991"/>
     <w:multiLevelType w:val="multilevel"/>
     <w:lvl w:ilvl="0">
       <w:numFmt w:val="bullet"/>
-      <w:lvlText w:val=""/>
+      <w:lvlText w:val="•"/>
       <w:lvlJc w:val="left"/>
       <w:pPr>
-        <w:ind w:left="720" w:hanging="360"/>
-      </w:pPr>
-      <w:rPr>
-        <w:rFonts w:ascii="Symbol" w:hAnsi="Symbol" w:cs="Symbol" w:hint="default"/>
-      </w:rPr>
+        <w:ind w:left="720" w:hanging="480"/>
+      </w:pPr>
     </w:lvl>
     <w:lvl w:ilvl="1">
       <w:numFmt w:val="bullet"/>
-      <w:lvlText w:val="o"/>
+      <w:lvlText w:val="–"/>
       <w:lvlJc w:val="left"/>
       <w:pPr>
-        <w:ind w:left="1440" w:hanging="360"/>
-      </w:pPr>
-      <w:rPr>
-        <w:rFonts w:ascii="Courier New" w:hAnsi="Courier New" w:cs="Courier New" w:hint="default"/>
-      </w:rPr>
+        <w:ind w:left="1440" w:hanging="480"/>
+      </w:pPr>
     </w:lvl>
     <w:lvl w:ilvl="2">
       <w:numFmt w:val="bullet"/>
-      <w:lvlText w:val=""/>
+      <w:lvlText w:val="•"/>
       <w:lvlJc w:val="left"/>
       <w:pPr>
-        <w:ind w:left="2160" w:hanging="360"/>
-      </w:pPr>
-      <w:rPr>
-        <w:rFonts w:ascii="Wingdings" w:hAnsi="Wingdings" w:cs="Wingdings" w:hint="default"/>
-      </w:rPr>
+        <w:ind w:left="2160" w:hanging="480"/>
+      </w:pPr>
     </w:lvl>
     <w:lvl w:ilvl="3">
       <w:numFmt w:val="bullet"/>
-      <w:lvlText w:val=""/>
+      <w:lvlText w:val="–"/>
       <w:lvlJc w:val="left"/>
       <w:pPr>
-        <w:ind w:left="2880" w:hanging="360"/>
-      </w:pPr>
-      <w:rPr>
-        <w:rFonts w:ascii="Symbol" w:hAnsi="Symbol" w:cs="Symbol" w:hint="default"/>
-      </w:rPr>
+        <w:ind w:left="2880" w:hanging="480"/>
+      </w:pPr>
     </w:lvl>
     <w:lvl w:ilvl="4">
       <w:numFmt w:val="bullet"/>
-      <w:lvlText w:val="o"/>
+      <w:lvlText w:val="•"/>
       <w:lvlJc w:val="left"/>
       <w:pPr>
-        <w:ind w:left="3600" w:hanging="360"/>
-      </w:pPr>
-      <w:rPr>
-        <w:rFonts w:ascii="Courier New" w:hAnsi="Courier New" w:cs="Courier New" w:hint="default"/>
-      </w:rPr>
+        <w:ind w:left="3600" w:hanging="480"/>
+      </w:pPr>
     </w:lvl>
     <w:lvl w:ilvl="5">
       <w:numFmt w:val="bullet"/>
-      <w:lvlText w:val=""/>
+      <w:lvlText w:val="–"/>
       <w:lvlJc w:val="left"/>
       <w:pPr>
-        <w:ind w:left="4320" w:hanging="360"/>
-      </w:pPr>
-      <w:rPr>
-        <w:rFonts w:ascii="Wingdings" w:hAnsi="Wingdings" w:cs="Wingdings" w:hint="default"/>
-      </w:rPr>
+        <w:ind w:left="4320" w:hanging="480"/>
+      </w:pPr>
     </w:lvl>
     <w:lvl w:ilvl="6">
       <w:numFmt w:val="bullet"/>
-      <w:lvlText w:val=""/>
+      <w:lvlText w:val="•"/>
       <w:lvlJc w:val="left"/>
       <w:pPr>
-        <w:ind w:left="5040" w:hanging="360"/>
-      </w:pPr>
-      <w:rPr>
-        <w:rFonts w:ascii="Symbol" w:hAnsi="Symbol" w:cs="Symbol" w:hint="default"/>
-      </w:rPr>
+        <w:ind w:left="5040" w:hanging="480"/>
+      </w:pPr>
     </w:lvl>
     <w:lvl w:ilvl="7">
       <w:numFmt w:val="bullet"/>
-      <w:lvlText w:val="o"/>
+      <w:lvlText w:val="–"/>
       <w:lvlJc w:val="left"/>
       <w:pPr>
-        <w:ind w:left="5760" w:hanging="360"/>
-      </w:pPr>
-      <w:rPr>
-        <w:rFonts w:ascii="Courier New" w:hAnsi="Courier New" w:cs="Courier New" w:hint="default"/>
-      </w:rPr>
+        <w:ind w:left="5760" w:hanging="480"/>
+      </w:pPr>
     </w:lvl>
     <w:lvl w:ilvl="8">
       <w:numFmt w:val="bullet"/>
-      <w:lvlText w:val=""/>
+      <w:lvlText w:val="•"/>
       <w:lvlJc w:val="left"/>
       <w:pPr>
-        <w:ind w:left="6480" w:hanging="360"/>
-      </w:pPr>
-      <w:rPr>
-        <w:rFonts w:ascii="Wingdings" w:hAnsi="Wingdings" w:cs="Wingdings" w:hint="default"/>
-      </w:rPr>
+        <w:ind w:left="6480" w:hanging="480"/>
+      </w:pPr>
     </w:lvl>
   </w:abstractNum>
   <w:num w:numId="1000">
@@ -1311,8 +1284,8 @@
     <w:name w:val="KeywordTok"/>
     <w:basedOn w:val="VerbatimChar"/>
     <w:rPr>
+      <w:color w:val="007020"/>
       <w:b/>
-      <w:color w:val="007020"/>
     </w:rPr>
   </w:style>
   <w:style w:type="character" w:customStyle="1" w:styleId="DataTypeTok">
@@ -1389,42 +1362,42 @@
     <w:name w:val="ImportTok"/>
     <w:basedOn w:val="VerbatimChar"/>
     <w:rPr>
+      <w:color w:val="008000"/>
       <w:b/>
-      <w:color w:val="008000"/>
     </w:rPr>
   </w:style>
   <w:style w:type="character" w:customStyle="1" w:styleId="CommentTok">
     <w:name w:val="CommentTok"/>
     <w:basedOn w:val="VerbatimChar"/>
     <w:rPr>
+      <w:color w:val="60a0b0"/>
       <w:i/>
-      <w:color w:val="60a0b0"/>
     </w:rPr>
   </w:style>
   <w:style w:type="character" w:customStyle="1" w:styleId="DocumentationTok">
     <w:name w:val="DocumentationTok"/>
     <w:basedOn w:val="VerbatimChar"/>
     <w:rPr>
+      <w:color w:val="ba2121"/>
       <w:i/>
-      <w:color w:val="ba2121"/>
     </w:rPr>
   </w:style>
   <w:style w:type="character" w:customStyle="1" w:styleId="AnnotationTok">
     <w:name w:val="AnnotationTok"/>
     <w:basedOn w:val="VerbatimChar"/>
     <w:rPr>
+      <w:color w:val="60a0b0"/>
       <w:b/>
       <w:i/>
-      <w:color w:val="60a0b0"/>
     </w:rPr>
   </w:style>
   <w:style w:type="character" w:customStyle="1" w:styleId="CommentVarTok">
     <w:name w:val="CommentVarTok"/>
     <w:basedOn w:val="VerbatimChar"/>
     <w:rPr>
+      <w:color w:val="60a0b0"/>
       <w:b/>
       <w:i/>
-      <w:color w:val="60a0b0"/>
     </w:rPr>
   </w:style>
   <w:style w:type="character" w:customStyle="1" w:styleId="OtherTok">
@@ -1452,8 +1425,8 @@
     <w:name w:val="ControlFlowTok"/>
     <w:basedOn w:val="VerbatimChar"/>
     <w:rPr>
+      <w:color w:val="007020"/>
       <w:b/>
-      <w:color w:val="007020"/>
     </w:rPr>
   </w:style>
   <w:style w:type="character" w:customStyle="1" w:styleId="OperatorTok">
@@ -1498,34 +1471,34 @@
     <w:name w:val="InformationTok"/>
     <w:basedOn w:val="VerbatimChar"/>
     <w:rPr>
+      <w:color w:val="60a0b0"/>
       <w:b/>
       <w:i/>
-      <w:color w:val="60a0b0"/>
     </w:rPr>
   </w:style>
   <w:style w:type="character" w:customStyle="1" w:styleId="WarningTok">
     <w:name w:val="WarningTok"/>
     <w:basedOn w:val="VerbatimChar"/>
     <w:rPr>
+      <w:color w:val="60a0b0"/>
       <w:b/>
       <w:i/>
-      <w:color w:val="60a0b0"/>
     </w:rPr>
   </w:style>
   <w:style w:type="character" w:customStyle="1" w:styleId="AlertTok">
     <w:name w:val="AlertTok"/>
     <w:basedOn w:val="VerbatimChar"/>
     <w:rPr>
+      <w:color w:val="ff0000"/>
       <w:b/>
-      <w:color w:val="ff0000"/>
     </w:rPr>
   </w:style>
   <w:style w:type="character" w:customStyle="1" w:styleId="ErrorTok">
     <w:name w:val="ErrorTok"/>
     <w:basedOn w:val="VerbatimChar"/>
     <w:rPr>
+      <w:color w:val="ff0000"/>
       <w:b/>
-      <w:color w:val="ff0000"/>
     </w:rPr>
   </w:style>
   <w:style w:type="character" w:customStyle="1" w:styleId="NormalTok">

</xml_diff>

<commit_message>
Rebuild outputs/ after Wave 1 + Wave 2 merges (11 PRs landed)
Regenerates the eight tracked .docx artifacts via scripts/build_binder.sh
against current main, reflecting binder content from PRs #52, #58-#61,
#63, #64, #65, #66, #67, #68 (HF-2, HF-6, HF-7, HF-8, HF-9, HF-11, HF-12,
HF-13, HF-14, HF-15, HF-16).

Per CLAUDE.md, outputs/ is tracked for the designer review workflow;
binary churn is accepted.

Co-Authored-By: Claude Opus 4.7 (1M context) <noreply@anthropic.com>
</commit_message>
<xml_diff>
--- a/outputs/01_Introduction.docx
+++ b/outputs/01_Introduction.docx
@@ -92,23 +92,11 @@
         <w:pStyle w:val="FirstParagraph"/>
       </w:pPr>
       <w:r>
-        <w:t xml:space="preserve">This binder documents three completed performance objectives undertaken during the Spring 2026 review period — and a fourth objective that was not, strictly speaking, assigned. The three formal objectives are discrete deliverables: a cross-departmental capstone framework, a four-module source-control curriculum, and a project-management contribution to a live institutional fraud-detection tool. They were specified in advance, completed on schedule, and assessed against criteria the reviewer can verify against the supporting artifacts.</w:t>
-      </w:r>
-    </w:p>
-    <w:p>
-      <w:pPr>
-        <w:pStyle w:val="BodyText"/>
-      </w:pPr>
-      <w:r>
-        <w:t xml:space="preserve">The fourth objective — labeled here as Objective Zero — is the design and construction of the instructional environment inside which the other three operate. It is documented last in the binder because it is the architecture, and architecture is most usefully read after the reader has held the finished rooms in hand.</w:t>
-      </w:r>
-    </w:p>
-    <w:p>
-      <w:pPr>
-        <w:pStyle w:val="BodyText"/>
-      </w:pPr>
-      <w:r>
-        <w:t xml:space="preserve">The binder is organized for two reading paths:</w:t>
+        <w:rPr>
+          <w:b/>
+          <w:bCs/>
+        </w:rPr>
+        <w:t xml:space="preserve">The original objectives, as assigned (verbatim baseline):</w:t>
       </w:r>
     </w:p>
     <w:p>
@@ -124,13 +112,13 @@
           <w:b/>
           <w:bCs/>
         </w:rPr>
-        <w:t xml:space="preserve">The reviewer with time</w:t>
-      </w:r>
-      <w:r>
-        <w:t xml:space="preserve"> </w:t>
-      </w:r>
-      <w:r>
-        <w:t xml:space="preserve">reads it front-to-back: this Introduction, the Executive Summary, three objective chapters in order, then Objective Zero, then the supporting documentation appendix.</w:t>
+        <w:t xml:space="preserve">Objective 1:</w:t>
+      </w:r>
+      <w:r>
+        <w:t xml:space="preserve"> </w:t>
+      </w:r>
+      <w:r>
+        <w:t xml:space="preserve">“Meet three times with cross-department students for assignments.”</w:t>
       </w:r>
     </w:p>
     <w:p>
@@ -146,56 +134,52 @@
           <w:b/>
           <w:bCs/>
         </w:rPr>
-        <w:t xml:space="preserve">The reviewer without time</w:t>
-      </w:r>
-      <w:r>
-        <w:t xml:space="preserve"> </w:t>
-      </w:r>
-      <w:r>
-        <w:t xml:space="preserve">reads the Executive Summary and stops. That summary is built to stand alone. The metrics, the per-objective synopses, and the bottom-line outcome statement are all there. The remainder of the binder is the evidence base for those claims, available when wanted.</w:t>
-      </w:r>
-    </w:p>
-    <w:p>
-      <w:pPr>
-        <w:pStyle w:val="FirstParagraph"/>
-      </w:pPr>
-      <w:r>
-        <w:t xml:space="preserve">Either path is legitimate. The binder was designed to reward both.</w:t>
-      </w:r>
-    </w:p>
-    <w:p>
-      <w:r>
-        <w:pict>
-          <v:rect style="width:0;height:1.5pt" o:hralign="center" o:hrstd="t" o:hr="t"/>
-        </w:pict>
-      </w:r>
-    </w:p>
-    <w:bookmarkEnd w:id="9"/>
-    <w:bookmarkStart w:id="10" w:name="the-unifying-methodological-thread"/>
-    <w:p>
-      <w:pPr>
-        <w:pStyle w:val="Heading2"/>
-      </w:pPr>
-      <w:r>
-        <w:t xml:space="preserve">The Unifying Methodological Thread</w:t>
-      </w:r>
-    </w:p>
-    <w:p>
-      <w:pPr>
-        <w:pStyle w:val="FirstParagraph"/>
-      </w:pPr>
-      <w:r>
-        <w:t xml:space="preserve">A single design principle runs through every objective in this review, including the one that was never formally assigned:</w:t>
-      </w:r>
-      <w:r>
-        <w:t xml:space="preserve"> </w:t>
-      </w:r>
+        <w:t xml:space="preserve">Objective 2:</w:t>
+      </w:r>
+      <w:r>
+        <w:t xml:space="preserve"> </w:t>
+      </w:r>
+      <w:r>
+        <w:t xml:space="preserve">“Four assignments covering the topic</w:t>
+      </w:r>
+      <w:r>
+        <w:t xml:space="preserve"> </w:t>
+      </w:r>
+      <w:r>
+        <w:t xml:space="preserve">‘GitHub collaboration and version control with your team’</w:t>
+      </w:r>
+      <w:r>
+        <w:t xml:space="preserve">. (The assignments were delivered, but were disguised as portions of a game.)”</w:t>
+      </w:r>
+    </w:p>
+    <w:p>
+      <w:pPr>
+        <w:pStyle w:val="Compact"/>
+        <w:numPr>
+          <w:ilvl w:val="0"/>
+          <w:numId w:val="1001"/>
+        </w:numPr>
+      </w:pPr>
       <w:r>
         <w:rPr>
           <w:b/>
           <w:bCs/>
         </w:rPr>
-        <w:t xml:space="preserve">measure rate of change, not absolute position.</w:t>
+        <w:t xml:space="preserve">Objective 3:</w:t>
+      </w:r>
+      <w:r>
+        <w:t xml:space="preserve"> </w:t>
+      </w:r>
+      <w:r>
+        <w:t xml:space="preserve">“attend three meetings towards planning Ghost Tool delivery timetable.”</w:t>
+      </w:r>
+    </w:p>
+    <w:p>
+      <w:pPr>
+        <w:pStyle w:val="FirstParagraph"/>
+      </w:pPr>
+      <w:r>
+        <w:t xml:space="preserve">This binder documents three completed performance objectives undertaken during the Spring 2026 review period — and a fourth objective that was not, strictly speaking, assigned. The three formal objectives are discrete deliverables: a cross-departmental capstone framework, a four-module source-control curriculum, and a project-management contribution to a live institutional fraud-detection tool. They were specified in advance, completed on schedule, and assessed against criteria the reviewer can verify against the supporting artifacts.</w:t>
       </w:r>
     </w:p>
     <w:p>
@@ -203,49 +187,102 @@
         <w:pStyle w:val="BodyText"/>
       </w:pPr>
       <w:r>
-        <w:t xml:space="preserve">Standard performance assessment — for students, for instructors, for institutional initiatives — measures</w:t>
-      </w:r>
-      <w:r>
-        <w:t xml:space="preserve"> </w:t>
-      </w:r>
+        <w:t xml:space="preserve">The fourth objective — labeled here as Objective Zero — is the design and construction of the instructional environment inside which the other three operate. It is documented last in the binder because it is the architecture, and architecture is most usefully read after the reader has held the finished rooms in hand.</w:t>
+      </w:r>
+    </w:p>
+    <w:p>
+      <w:pPr>
+        <w:pStyle w:val="BodyText"/>
+      </w:pPr>
+      <w:r>
+        <w:t xml:space="preserve">The binder is organized for two reading paths:</w:t>
+      </w:r>
+    </w:p>
+    <w:p>
+      <w:pPr>
+        <w:pStyle w:val="Compact"/>
+        <w:numPr>
+          <w:ilvl w:val="0"/>
+          <w:numId w:val="1002"/>
+        </w:numPr>
+      </w:pPr>
       <w:r>
         <w:rPr>
           <w:b/>
           <w:bCs/>
         </w:rPr>
-        <w:t xml:space="preserve">y</w:t>
-      </w:r>
-      <w:r>
-        <w:t xml:space="preserve">: where someone is on a scale at a given moment. The student who finishes the semester at the 65th percentile is graded above the one who finishes at the 50th. The course that produced a 4.2 average on the end-of-term survey is rated higher than the one that produced a 4.0. The instructor whose evaluation numbers improved a fraction over the prior year is rated essentially the same as the one whose numbers held flat.</w:t>
-      </w:r>
-    </w:p>
-    <w:p>
-      <w:pPr>
-        <w:pStyle w:val="BodyText"/>
-      </w:pPr>
-      <w:r>
-        <w:t xml:space="preserve">This is the wrong measurement.</w:t>
-      </w:r>
-    </w:p>
-    <w:p>
-      <w:pPr>
-        <w:pStyle w:val="BodyText"/>
-      </w:pPr>
-      <w:r>
-        <w:t xml:space="preserve">What matters in a community college serving the Research Triangle job market — and what matters to any employer screening recent graduates — is</w:t>
-      </w:r>
-      <w:r>
-        <w:t xml:space="preserve"> </w:t>
-      </w:r>
+        <w:t xml:space="preserve">The reviewer with time</w:t>
+      </w:r>
+      <w:r>
+        <w:t xml:space="preserve"> </w:t>
+      </w:r>
+      <w:r>
+        <w:t xml:space="preserve">reads it front-to-back: this Introduction, the Executive Summary, three objective chapters in order, then Objective Zero, then the supporting documentation appendix.</w:t>
+      </w:r>
+    </w:p>
+    <w:p>
+      <w:pPr>
+        <w:pStyle w:val="Compact"/>
+        <w:numPr>
+          <w:ilvl w:val="0"/>
+          <w:numId w:val="1002"/>
+        </w:numPr>
+      </w:pPr>
       <w:r>
         <w:rPr>
           <w:b/>
           <w:bCs/>
         </w:rPr>
-        <w:t xml:space="preserve">dy/dx</w:t>
-      </w:r>
-      <w:r>
-        <w:t xml:space="preserve">: the rate at which a person develops capability. A student who arrived at zero and finished at fifty has demonstrated something more consequential for a hiring manager than the student who arrived at sixty and finished at sixty-five: they will not stay where they started. Credentials measure y. Careers are built on dy/dx.</w:t>
+        <w:t xml:space="preserve">The reviewer without time</w:t>
+      </w:r>
+      <w:r>
+        <w:t xml:space="preserve"> </w:t>
+      </w:r>
+      <w:r>
+        <w:t xml:space="preserve">reads the Executive Summary and stops. That summary is built to stand alone. The metrics, the per-objective synopses, and the bottom-line outcome statement are all there. The remainder of the binder is the evidence base for those claims, available when wanted.</w:t>
+      </w:r>
+    </w:p>
+    <w:p>
+      <w:pPr>
+        <w:pStyle w:val="FirstParagraph"/>
+      </w:pPr>
+      <w:r>
+        <w:t xml:space="preserve">Either path is legitimate. The binder was designed to reward both.</w:t>
+      </w:r>
+    </w:p>
+    <w:p>
+      <w:r>
+        <w:pict>
+          <v:rect style="width:0;height:1.5pt" o:hralign="center" o:hrstd="t" o:hr="t"/>
+        </w:pict>
+      </w:r>
+    </w:p>
+    <w:bookmarkEnd w:id="9"/>
+    <w:bookmarkStart w:id="10" w:name="a-note-on-evaluation-preference"/>
+    <w:p>
+      <w:pPr>
+        <w:pStyle w:val="Heading2"/>
+      </w:pPr>
+      <w:r>
+        <w:t xml:space="preserve">A Note on Evaluation Preference</w:t>
+      </w:r>
+    </w:p>
+    <w:p>
+      <w:pPr>
+        <w:pStyle w:val="FirstParagraph"/>
+      </w:pPr>
+      <w:r>
+        <w:t xml:space="preserve">The author has a personal request about how he would like to be measured in this review, surfaced here because the underlying motif appears in passing in the chapters that follow:</w:t>
+      </w:r>
+      <w:r>
+        <w:t xml:space="preserve"> </w:t>
+      </w:r>
+      <w:r>
+        <w:rPr>
+          <w:b/>
+          <w:bCs/>
+        </w:rPr>
+        <w:t xml:space="preserve">measure rate of change, not absolute position — dy/dx, not y, if that is feasible.</w:t>
       </w:r>
     </w:p>
     <w:p>
@@ -253,7 +290,7 @@
         <w:pStyle w:val="BodyText"/>
       </w:pPr>
       <w:r>
-        <w:t xml:space="preserve">The same logic applies one level up. A pedagogical framework that produces measurable iteration — students opening pull requests they would not previously have opened, design students sitting inside Scrum ceremonies they would not previously have attended, peer reviews that climb in quality over the term — is worth more than a curriculum that produces a higher single-point exam average and no observable change in behavior. The rubrics in this binder are constructed accordingly. They reward documented iteration over polished one-shot submission. They surface growth that absolute-position grading erases.</w:t>
+        <w:t xml:space="preserve">A student who arrived at zero and finished at fifty has demonstrated something more consequential to a hiring manager than the student who arrived at sixty and finished at sixty-five: they will not stay where they started. The author would prefer to be evaluated on the same basis — on movement and iteration over the review period — rather than on absolute position at a single moment.</w:t>
       </w:r>
     </w:p>
     <w:p>
@@ -261,7 +298,7 @@
         <w:pStyle w:val="BodyText"/>
       </w:pPr>
       <w:r>
-        <w:t xml:space="preserve">This is not a metaphor. It is a rubric design specification, applied consistently across all three objectives and operationalized in the supporting infrastructure.</w:t>
+        <w:t xml:space="preserve">This is a request to BLUE / INDIGO / VIOLET, not a rubric architecture applied to students. It is offered as a preference, not a deliverable.</w:t>
       </w:r>
     </w:p>
     <w:p>
@@ -638,6 +675,9 @@
     <w:abstractNumId w:val="990"/>
   </w:num>
   <w:num w:numId="1001">
+    <w:abstractNumId w:val="991"/>
+  </w:num>
+  <w:num w:numId="1002">
     <w:abstractNumId w:val="991"/>
   </w:num>
 </w:numbering>

</xml_diff>

<commit_message>
Rebuild outputs/ after Wave 3 + Wave 4 merges (5 PRs landed)
Regenerates the eight tracked .docx artifacts via scripts/build_binder.sh
against current main, reflecting binder content from the 5 PRs merged in
Waves 3 and 4 (#51, #53, #54, #55, #62 — HF-1, HF-3, HF-4, HF-5, HF-10).

With this rebuild, all 16 high-severity audit reframes (HF-1 through
HF-16) are reflected in the .docx outputs.

Per CLAUDE.md, outputs/ is tracked for the designer review workflow;
binary churn is accepted.

Co-Authored-By: Claude Opus 4.7 (1M context) <noreply@anthropic.com>
</commit_message>
<xml_diff>
--- a/outputs/01_Introduction.docx
+++ b/outputs/01_Introduction.docx
@@ -179,7 +179,7 @@
         <w:pStyle w:val="FirstParagraph"/>
       </w:pPr>
       <w:r>
-        <w:t xml:space="preserve">This binder documents three completed performance objectives undertaken during the Spring 2026 review period — and a fourth objective that was not, strictly speaking, assigned. The three formal objectives are discrete deliverables: a cross-departmental capstone framework, a four-module source-control curriculum, and a project-management contribution to a live institutional fraud-detection tool. They were specified in advance, completed on schedule, and assessed against criteria the reviewer can verify against the supporting artifacts.</w:t>
+        <w:t xml:space="preserve">This binder documents three completed performance objectives undertaken during the Spring 2026 review period. The three objectives are discrete deliverables: a cross-departmental capstone framework, a four-module source-control curriculum, and a project-management contribution to a live institutional fraud-detection tool. They were specified in advance, completed on schedule, and assessed against criteria the reviewer can verify against the supporting artifacts.</w:t>
       </w:r>
     </w:p>
     <w:p>
@@ -187,7 +187,7 @@
         <w:pStyle w:val="BodyText"/>
       </w:pPr>
       <w:r>
-        <w:t xml:space="preserve">The fourth objective — labeled here as Objective Zero — is the design and construction of the instructional environment inside which the other three operate. It is documented last in the binder because it is the architecture, and architecture is most usefully read after the reader has held the finished rooms in hand.</w:t>
+        <w:t xml:space="preserve">A final background chapter describes the in-character AlgoCratic Futures instructional environment — the delivery mechanism inside which the Objective 2 assignments were delivered (the assignments were delivered, but were disguised as portions of a game). It is documented last as supporting context for the other three chapters, not as a separate performance objective.</w:t>
       </w:r>
     </w:p>
     <w:p>
@@ -217,7 +217,7 @@
         <w:t xml:space="preserve"> </w:t>
       </w:r>
       <w:r>
-        <w:t xml:space="preserve">reads it front-to-back: this Introduction, the Executive Summary, three objective chapters in order, then Objective Zero, then the supporting documentation appendix.</w:t>
+        <w:t xml:space="preserve">reads it front-to-back: this Introduction, the Executive Summary, three objective chapters in order, then the background chapter on the instructional environment, then the supporting documentation appendix.</w:t>
       </w:r>
     </w:p>
     <w:p>
@@ -420,7 +420,7 @@
         <w:pStyle w:val="BodyText"/>
       </w:pPr>
       <w:r>
-        <w:t xml:space="preserve">The frame is load-bearing pedagogy. The structural argument for why it is load-bearing — Edmondson on psychological safety, Dweck on growth mindset, Lave and Wenger on situated learning — is laid out in Objective Zero. The reader needs one assurance before proceeding: the work documented here is professional. The absurdity is deliberate. The citations are real.</w:t>
+        <w:t xml:space="preserve">The frame is load-bearing pedagogy. The structural argument for why it is load-bearing — Edmondson on psychological safety, Dweck on growth mindset, Lave and Wenger on situated learning — is laid out in the background chapter on the instructional environment. The reader needs one assurance before proceeding: the work documented here is professional. The absurdity is deliberate. The citations are real.</w:t>
       </w:r>
     </w:p>
     <w:p>
@@ -445,7 +445,7 @@
         <w:pStyle w:val="FirstParagraph"/>
       </w:pPr>
       <w:r>
-        <w:t xml:space="preserve">The objectives in this binder were specified for a course delivery role. What was delivered exceeded that specification — not by doing more of the same thing, but by building, at the same time, the conditions under which the specified work could be performed reliably, measured honestly, and replicated by others. The four objective chapters and the supporting documentation appendix that follow are the receipt for that claim.</w:t>
+        <w:t xml:space="preserve">The objectives in this binder were specified for a course delivery role. Each was met. Some supporting infrastructure was built alongside — rubrics, milestone protocols, the instructional environment described in the background chapter — because building it was the path of least resistance to delivering the assigned work reliably. The objective chapters and the supporting documentation appendix that follow are the receipt for that claim.</w:t>
       </w:r>
     </w:p>
     <w:p>

</xml_diff>